<commit_message>
Complete Assignment 2 dApp integration
</commit_message>
<xml_diff>
--- a/Project_Report.docx
+++ b/Project_Report.docx
@@ -2,64 +2,119 @@
 <file path=word/document.xml><?xml version="1.0" encoding="utf-8"?>
 <w:document xmlns:wpc="http://schemas.microsoft.com/office/word/2010/wordprocessingCanvas" xmlns:mo="http://schemas.microsoft.com/office/mac/office/2008/main" xmlns:mc="http://schemas.openxmlformats.org/markup-compatibility/2006" xmlns:mv="urn:schemas-microsoft-com:mac:vml" xmlns:o="urn:schemas-microsoft-com:office:office" xmlns:r="http://schemas.openxmlformats.org/officeDocument/2006/relationships" xmlns:m="http://schemas.openxmlformats.org/officeDocument/2006/math" xmlns:v="urn:schemas-microsoft-com:vml" xmlns:wp14="http://schemas.microsoft.com/office/word/2010/wordprocessingDrawing" xmlns:wp="http://schemas.openxmlformats.org/drawingml/2006/wordprocessingDrawing" xmlns:w10="urn:schemas-microsoft-com:office:word" xmlns:w="http://schemas.openxmlformats.org/wordprocessingml/2006/main" xmlns:w14="http://schemas.microsoft.com/office/word/2010/wordml" xmlns:wpg="http://schemas.microsoft.com/office/word/2010/wordprocessingGroup" xmlns:wpi="http://schemas.microsoft.com/office/word/2010/wordprocessingInk" xmlns:wne="http://schemas.microsoft.com/office/word/2006/wordml" xmlns:wps="http://schemas.microsoft.com/office/word/2010/wordprocessingShape" mc:Ignorable="w14 wp14">
   <w:body>
+    <w:tbl>
+      <w:tblPr>
+        <w:tblW w:type="auto" w:w="0"/>
+        <w:jc w:val="center"/>
+        <w:tblLook w:firstColumn="1" w:firstRow="1" w:lastColumn="0" w:lastRow="0" w:noHBand="0" w:noVBand="1" w:val="04A0"/>
+      </w:tblPr>
+      <w:tblGrid>
+        <w:gridCol w:w="9792"/>
+      </w:tblGrid>
+      <w:tr>
+        <w:tc>
+          <w:tcPr>
+            <w:tcW w:type="dxa" w:w="9792"/>
+            <w:shd w:fill="111212"/>
+            <w:tcBorders>
+              <w:top w:val="single" w:sz="0" w:color="111212"/>
+              <w:left w:val="single" w:sz="0" w:color="111212"/>
+              <w:bottom w:val="single" w:sz="0" w:color="111212"/>
+              <w:right w:val="single" w:sz="0" w:color="111212"/>
+            </w:tcBorders>
+          </w:tcPr>
+          <w:p>
+            <w:pPr>
+              <w:spacing w:before="400" w:after="400"/>
+              <w:jc w:val="center"/>
+            </w:pPr>
+            <w:r>
+              <w:drawing>
+                <wp:inline xmlns:a="http://schemas.openxmlformats.org/drawingml/2006/main" xmlns:pic="http://schemas.openxmlformats.org/drawingml/2006/picture">
+                  <wp:extent cx="5029200" cy="911493"/>
+                  <wp:docPr id="1" name="Picture 1"/>
+                  <wp:cNvGraphicFramePr>
+                    <a:graphicFrameLocks noChangeAspect="1"/>
+                  </wp:cNvGraphicFramePr>
+                  <a:graphic>
+                    <a:graphicData uri="http://schemas.openxmlformats.org/drawingml/2006/picture">
+                      <pic:pic>
+                        <pic:nvPicPr>
+                          <pic:cNvPr id="0" name="alu-logo.png"/>
+                          <pic:cNvPicPr/>
+                        </pic:nvPicPr>
+                        <pic:blipFill>
+                          <a:blip r:embed="rId11"/>
+                          <a:stretch>
+                            <a:fillRect/>
+                          </a:stretch>
+                        </pic:blipFill>
+                        <pic:spPr>
+                          <a:xfrm>
+                            <a:off x="0" y="0"/>
+                            <a:ext cx="5029200" cy="911493"/>
+                          </a:xfrm>
+                          <a:prstGeom prst="rect"/>
+                        </pic:spPr>
+                      </pic:pic>
+                    </a:graphicData>
+                  </a:graphic>
+                </wp:inline>
+              </w:drawing>
+            </w:r>
+          </w:p>
+        </w:tc>
+      </w:tr>
+    </w:tbl>
     <w:p>
       <w:pPr>
-        <w:spacing w:after="120" w:line="259" w:lineRule="auto"/>
+        <w:pStyle w:val="Title"/>
+        <w:jc w:val="center"/>
+      </w:pPr>
+      <w:r>
+        <w:t>DApp Integration with Smart Contracts</w:t>
+      </w:r>
+    </w:p>
+    <w:p>
+      <w:pPr>
         <w:jc w:val="center"/>
       </w:pPr>
       <w:r>
         <w:rPr>
           <w:b/>
-          <w:color w:val="1F4E5F"/>
-          <w:sz w:val="40"/>
         </w:rPr>
-        <w:t>Assignment 1 - Cryptocurrency and Digital Assets</w:t>
+        <w:t>ALU Digital Asset Protection System</w:t>
       </w:r>
     </w:p>
     <w:p>
       <w:pPr>
-        <w:spacing w:after="120" w:line="259" w:lineRule="auto"/>
+        <w:spacing w:before="800"/>
         <w:jc w:val="center"/>
       </w:pPr>
       <w:r>
         <w:rPr>
           <w:b/>
-          <w:sz w:val="26"/>
         </w:rPr>
-        <w:t>Project Report: ALU Logo Blockchain Registration and Tokenisation</w:t>
+        <w:t>Individual Assignment 2</w:t>
+        <w:br/>
+      </w:r>
+      <w:r>
+        <w:t>Student: Mozia Precious Chibundu</w:t>
+        <w:br/>
+      </w:r>
+      <w:r>
+        <w:t>Institution: African Leadership University</w:t>
+        <w:br/>
+      </w:r>
+      <w:r>
+        <w:t>Submission Date: 17 July 2026</w:t>
+        <w:br/>
+      </w:r>
+      <w:r>
+        <w:t>GitHub: https://github.com/Kodedbykenzie/alu-digital-asset-protection</w:t>
       </w:r>
     </w:p>
     <w:p>
-      <w:pPr>
-        <w:spacing w:after="120" w:line="259" w:lineRule="auto"/>
-        <w:jc w:val="center"/>
-      </w:pPr>
-      <w:r>
-        <w:t>Student Name: Mozia Precious Chibundu</w:t>
-        <w:br/>
-        <w:t>Course: Cryptocurrency and Digital Assets</w:t>
-        <w:br/>
-        <w:t>GitHub Link: PASTE_YOUR_PUBLIC_GITHUB_LINK_HERE</w:t>
-        <w:br/>
-        <w:t>Demo Video Link: PASTE_YOUR_VIDEO_LINK_HERE</w:t>
-      </w:r>
-    </w:p>
-    <w:p>
-      <w:pPr>
-        <w:spacing w:after="120" w:line="259" w:lineRule="auto"/>
-        <w:jc w:val="center"/>
-      </w:pPr>
-      <w:r>
-        <w:rPr>
-          <w:i/>
-        </w:rPr>
-        <w:t>Important: Replace the Coinbase screenshot placeholders, GitHub link, and video link before final submission.</w:t>
-      </w:r>
-    </w:p>
-    <w:p>
-      <w:pPr>
-        <w:spacing w:after="120" w:line="259" w:lineRule="auto"/>
-      </w:pPr>
       <w:r>
         <w:br w:type="page"/>
       </w:r>
@@ -67,91 +122,165 @@
     <w:p>
       <w:pPr>
         <w:pStyle w:val="Heading1"/>
-        <w:spacing w:after="120" w:line="259" w:lineRule="auto"/>
+        <w:keepNext/>
       </w:pPr>
       <w:r>
         <w:t>Abstract</w:t>
       </w:r>
     </w:p>
     <w:p>
-      <w:pPr>
-        <w:spacing w:after="120" w:line="259" w:lineRule="auto"/>
-      </w:pPr>
       <w:r>
-        <w:t>This project demonstrates how a real digital asset, the official ALU logo, can be registered and protected on an Ethereum-compatible blockchain. The solution uses an ERC-721 smart contract to store a permanent ownership record and SHA-256 file fingerprint, then uses an ERC-20 token contract to split logo ownership into 1,000,000 ALUT shares.</w:t>
+        <w:t>This project extends two previously developed Solidity smart contracts into a complete decentralised application. The React interface allows ALU stakeholders to connect a Web3 wallet, generate SHA-256 fingerprints of image files inside the browser, register digital assets, verify whether a logo is authentic without connecting a wallet, and view or distribute ALUT ownership shares. The system addresses the gap between technically correct blockchain contracts and a product that students, faculty, administrators and external partners can use through a normal web browser.</w:t>
       </w:r>
     </w:p>
     <w:p>
       <w:pPr>
         <w:pStyle w:val="Heading1"/>
-        <w:spacing w:after="120" w:line="259" w:lineRule="auto"/>
+        <w:keepNext/>
       </w:pPr>
       <w:r>
-        <w:t>Question 1: Cryptocurrency Exchange Platform Report</w:t>
+        <w:t>1. Introduction</w:t>
+      </w:r>
+    </w:p>
+    <w:p>
+      <w:r>
+        <w:t>Formative Assessment 1 produced two working contracts: ALUAssetRegistry, an ERC-721 registry for unique logo fingerprints, and ALULogoToken, an ERC-20 token with a fixed supply of 1,000,000 ALUT. Although the contracts successfully stored and managed blockchain data, interaction originally required Hardhat commands and JavaScript scripts. This was a major usability gap because ordinary ALU users should not need to understand terminals, contract addresses, ABIs or hexadecimal transaction data.</w:t>
+      </w:r>
+    </w:p>
+    <w:p>
+      <w:r>
+        <w:t>The Assignment 2 dApp acts as the front door to the contracts. It converts contract functions into clear forms, buttons, status messages and dashboards. The user interface separates public read-only activities from state-changing transactions. Anyone can verify a logo through a read-only RPC call, while registration and token distribution require a connected wallet and explicit approval.</w:t>
       </w:r>
     </w:p>
     <w:p>
       <w:pPr>
-        <w:spacing w:after="120" w:line="259" w:lineRule="auto"/>
+        <w:pStyle w:val="Heading1"/>
+        <w:keepNext/>
       </w:pPr>
       <w:r>
-        <w:t>For the exchange exploration, I used Coinbase as my example cryptocurrency platform. During registration, the platform asked for basic account details such as an email address, password, legal name, date of birth, country of residence, phone number, and identity verification. The identity stage normally requires a government-issued ID and sometimes a live selfie. Exchanges require this Know Your Customer process because they operate as financial service providers and must reduce fraud, money laundering, terrorist financing, and sanctions violations. In practice, KYC and AML rules make it harder for anonymous users to move illegal funds through the platform.</w:t>
+        <w:t>2. Architecture Overview</w:t>
       </w:r>
     </w:p>
     <w:p>
-      <w:pPr>
-        <w:spacing w:after="120" w:line="259" w:lineRule="auto"/>
-      </w:pPr>
       <w:r>
-        <w:t>The dashboard gives a general view of prices, watchlists, balances, and recent activity. The wallet section shows assets the user owns and the address or network options for deposits and withdrawals. The trading section allows a user to buy, sell, convert, or place advanced orders. Three cryptocurrencies I found were Bitcoin, Ethereum, and Solana. Bitcoin is the first major cryptocurrency and is mostly used as digital money or a store of value. Its main difference is that it focuses more on scarcity and security than smart contracts. Ethereum is used not only as a cryptocurrency but also as a smart contract platform for NFTs, DeFi, and dApps. Its main difference is programmability. Solana is also a smart contract blockchain, but it is designed for faster and cheaper transactions, making it popular for high-volume applications.</w:t>
-      </w:r>
-    </w:p>
-    <w:p>
-      <w:pPr>
-        <w:spacing w:after="120" w:line="259" w:lineRule="auto"/>
-      </w:pPr>
-      <w:r>
-        <w:t>In the payment settings, a user can add a bank account or debit card by entering account details, card details, billing address, and sometimes completing a small verification step. A debit card is usually faster because the purchase can be almost instant, but it can be more expensive. A bank transfer is usually cheaper for deposits, but it may take longer to settle before the funds can be used or withdrawn.</w:t>
-      </w:r>
-    </w:p>
-    <w:p>
-      <w:pPr>
-        <w:spacing w:after="120" w:line="259" w:lineRule="auto"/>
-      </w:pPr>
-      <w:r>
-        <w:t>For a simulated purchase, I chose Ethereum because it connects directly to the second part of this assignment. A market order buys immediately at the best available current price, while a limit order only executes when the market reaches a price selected by the user. I would choose a market order for this small $100 simulation because the goal is learning the purchase process rather than waiting for a specific price. The final preview screen shows the price, fees, spread, and the exact ETH amount before confirmation. For example, if ETH was about $1,600 and $98 remained after estimated fees and spread, the user would receive about 0.06125 ETH. The actual number must come from the exchange preview at the time of purchase.</w:t>
-      </w:r>
-    </w:p>
-    <w:p>
-      <w:pPr>
-        <w:spacing w:after="120" w:line="259" w:lineRule="auto"/>
-      </w:pPr>
-      <w:r>
-        <w:t>The transaction history section records the asset bought or sold, amount, date and time, payment method, fees, status, and transaction reference. For blockchain withdrawals, a transaction hash is very important because it is the unique identifier of the transaction on the blockchain. Anyone can paste it into a blockchain explorer to check confirmations and verify where the funds moved.</w:t>
-      </w:r>
-    </w:p>
-    <w:p>
-      <w:pPr>
-        <w:spacing w:after="120" w:line="259" w:lineRule="auto"/>
-      </w:pPr>
-      <w:r>
-        <w:t>Coinbase also provides security features. Two-factor authentication requires a second code in addition to the password, which protects the account if the password is stolen. Withdrawal controls or address allowlisting limit where crypto can be sent, reducing the risk of an attacker quickly draining the account. These tools matter because blockchain transactions are difficult or impossible to reverse once confirmed.</w:t>
+        <w:t>The application follows a client-side Web3 architecture. React controls the interface and page navigation. ethers.js creates contract objects from the ABI and deployment address. The Web Crypto API hashes files locally. MetaMask supplies the signer for transactions, while a JSON-RPC provider supports public read-only verification.</w:t>
       </w:r>
     </w:p>
     <w:tbl>
       <w:tblPr>
+        <w:tblStyle w:val="TableGrid"/>
         <w:tblW w:type="auto" w:w="0"/>
         <w:jc w:val="center"/>
         <w:tblLook w:firstColumn="1" w:firstRow="1" w:lastColumn="0" w:lastRow="0" w:noHBand="0" w:noVBand="1" w:val="04A0"/>
       </w:tblPr>
       <w:tblGrid>
-        <w:gridCol w:w="10080"/>
+        <w:gridCol w:w="1958"/>
+        <w:gridCol w:w="1958"/>
+        <w:gridCol w:w="1958"/>
+        <w:gridCol w:w="1958"/>
+        <w:gridCol w:w="1958"/>
       </w:tblGrid>
       <w:tr>
         <w:tc>
           <w:tcPr>
-            <w:tcW w:type="dxa" w:w="9360"/>
-            <w:shd w:fill="EDEDED"/>
+            <w:tcW w:type="dxa" w:w="1958"/>
+            <w:shd w:fill="E2352D"/>
+          </w:tcPr>
+          <w:p>
+            <w:pPr>
+              <w:jc w:val="center"/>
+            </w:pPr>
+            <w:r>
+              <w:rPr>
+                <w:b/>
+                <w:color w:val="FFFFFF"/>
+                <w:sz w:val="18"/>
+              </w:rPr>
+              <w:t>User</w:t>
+            </w:r>
+          </w:p>
+        </w:tc>
+        <w:tc>
+          <w:tcPr>
+            <w:tcW w:type="dxa" w:w="1958"/>
+            <w:shd w:fill="E2352D"/>
+          </w:tcPr>
+          <w:p>
+            <w:pPr>
+              <w:jc w:val="center"/>
+            </w:pPr>
+            <w:r>
+              <w:rPr>
+                <w:b/>
+                <w:color w:val="FFFFFF"/>
+                <w:sz w:val="18"/>
+              </w:rPr>
+              <w:t>React dApp</w:t>
+            </w:r>
+          </w:p>
+        </w:tc>
+        <w:tc>
+          <w:tcPr>
+            <w:tcW w:type="dxa" w:w="1958"/>
+            <w:shd w:fill="E2352D"/>
+          </w:tcPr>
+          <w:p>
+            <w:pPr>
+              <w:jc w:val="center"/>
+            </w:pPr>
+            <w:r>
+              <w:rPr>
+                <w:b/>
+                <w:color w:val="FFFFFF"/>
+                <w:sz w:val="18"/>
+              </w:rPr>
+              <w:t>ethers.js / Web Crypto</w:t>
+            </w:r>
+          </w:p>
+        </w:tc>
+        <w:tc>
+          <w:tcPr>
+            <w:tcW w:type="dxa" w:w="1958"/>
+            <w:shd w:fill="E2352D"/>
+          </w:tcPr>
+          <w:p>
+            <w:pPr>
+              <w:jc w:val="center"/>
+            </w:pPr>
+            <w:r>
+              <w:rPr>
+                <w:b/>
+                <w:color w:val="FFFFFF"/>
+                <w:sz w:val="18"/>
+              </w:rPr>
+              <w:t>Wallet or RPC Provider</w:t>
+            </w:r>
+          </w:p>
+        </w:tc>
+        <w:tc>
+          <w:tcPr>
+            <w:tcW w:type="dxa" w:w="1958"/>
+            <w:shd w:fill="E2352D"/>
+          </w:tcPr>
+          <w:p>
+            <w:pPr>
+              <w:jc w:val="center"/>
+            </w:pPr>
+            <w:r>
+              <w:rPr>
+                <w:b/>
+                <w:color w:val="FFFFFF"/>
+                <w:sz w:val="18"/>
+              </w:rPr>
+              <w:t>Smart Contracts</w:t>
+            </w:r>
+          </w:p>
+        </w:tc>
+      </w:tr>
+      <w:tr>
+        <w:tc>
+          <w:tcPr>
+            <w:tcW w:type="dxa" w:w="1958"/>
             <w:vAlign w:val="center"/>
           </w:tcPr>
           <w:p>
@@ -159,11 +288,63 @@
               <w:jc w:val="center"/>
             </w:pPr>
             <w:r>
-              <w:rPr>
-                <w:i/>
-                <w:sz w:val="20"/>
-              </w:rPr>
-              <w:t>Insert screenshots here: Coinbase sign-up/identity verification, dashboard, wallet, trading preview, transaction history, and security settings.</w:t>
+              <w:t>Student, staff, public or administrator</w:t>
+            </w:r>
+          </w:p>
+        </w:tc>
+        <w:tc>
+          <w:tcPr>
+            <w:tcW w:type="dxa" w:w="1958"/>
+            <w:vAlign w:val="center"/>
+          </w:tcPr>
+          <w:p>
+            <w:pPr>
+              <w:jc w:val="center"/>
+            </w:pPr>
+            <w:r>
+              <w:t>Register, Verify and Dashboard pages</w:t>
+            </w:r>
+          </w:p>
+        </w:tc>
+        <w:tc>
+          <w:tcPr>
+            <w:tcW w:type="dxa" w:w="1958"/>
+            <w:vAlign w:val="center"/>
+          </w:tcPr>
+          <w:p>
+            <w:pPr>
+              <w:jc w:val="center"/>
+            </w:pPr>
+            <w:r>
+              <w:t>ABI calls and SHA-256 hashing</w:t>
+            </w:r>
+          </w:p>
+        </w:tc>
+        <w:tc>
+          <w:tcPr>
+            <w:tcW w:type="dxa" w:w="1958"/>
+            <w:vAlign w:val="center"/>
+          </w:tcPr>
+          <w:p>
+            <w:pPr>
+              <w:jc w:val="center"/>
+            </w:pPr>
+            <w:r>
+              <w:t>MetaMask signer or read-only provider</w:t>
+            </w:r>
+          </w:p>
+        </w:tc>
+        <w:tc>
+          <w:tcPr>
+            <w:tcW w:type="dxa" w:w="1958"/>
+            <w:vAlign w:val="center"/>
+          </w:tcPr>
+          <w:p>
+            <w:pPr>
+              <w:jc w:val="center"/>
+            </w:pPr>
+            <w:r>
+              <w:t>ALUAssetRegistry and ALULogoToken</w:t>
             </w:r>
           </w:p>
         </w:tc>
@@ -171,458 +352,965 @@
     </w:tbl>
     <w:p>
       <w:pPr>
-        <w:spacing w:after="120" w:line="259" w:lineRule="auto"/>
-      </w:pPr>
-    </w:p>
-    <w:p>
-      <w:pPr>
-        <w:pStyle w:val="Heading1"/>
-        <w:spacing w:after="120" w:line="259" w:lineRule="auto"/>
+        <w:pStyle w:val="FigureCaption"/>
+        <w:jc w:val="center"/>
       </w:pPr>
       <w:r>
-        <w:t>Introduction</w:t>
+        <w:t>Figure 1. High-level dApp architecture and communication flow.</w:t>
       </w:r>
     </w:p>
     <w:p>
       <w:pPr>
-        <w:spacing w:after="120" w:line="259" w:lineRule="auto"/>
+        <w:pStyle w:val="Heading2"/>
+        <w:keepNext/>
       </w:pPr>
       <w:r>
-        <w:t>ALU needs to protect its official logo because logos are part of an institution's identity, reputation, and public trust. A copied or modified logo can be used in fake admission messages, unofficial events, fraudulent documents, or misleading online pages. A normal database can store a file record, but whoever controls the database can edit or delete the record. Standard copyright registration can prove legal ownership, but it does not automatically let anyone check whether a specific digital file is the exact authentic version. By registering the logo hash on a blockchain, ALU gets a tamper-resistant public record showing who registered the logo, when it was registered, and what exact file fingerprint represents the official version.</w:t>
+        <w:t>2.1 ABI and Contract Addresses</w:t>
+      </w:r>
+    </w:p>
+    <w:p>
+      <w:r>
+        <w:t>An Application Binary Interface (ABI) is a machine-readable description of the public functions, events, parameters and return values exposed by a smart contract. The frontend needs the ABI to encode calls such as registerAsset() and decode returned values such as asset metadata. It also needs the deployed address because the address identifies the exact contract instance on the selected blockchain network.</w:t>
+      </w:r>
+    </w:p>
+    <w:p>
+      <w:r>
+        <w:t>The updated deployment script deploys both contracts, registers the official logo, creates three example token holders and writes the current addresses, holder addresses and ABIs into the frontend. This reduces configuration mistakes after restarting the local Hardhat network.</w:t>
       </w:r>
     </w:p>
     <w:p>
       <w:pPr>
         <w:pStyle w:val="Heading1"/>
-        <w:spacing w:after="120" w:line="259" w:lineRule="auto"/>
+        <w:keepNext/>
       </w:pPr>
       <w:r>
-        <w:t>Blockchain Setup</w:t>
+        <w:t>3. Feature Walkthrough</w:t>
       </w:r>
     </w:p>
     <w:p>
       <w:pPr>
-        <w:spacing w:after="120" w:line="259" w:lineRule="auto"/>
+        <w:pStyle w:val="Heading2"/>
+        <w:keepNext/>
       </w:pPr>
       <w:r>
-        <w:t>The project was built using Node.js and Hardhat. Hardhat creates a local Ethereum development environment that runs on my own computer. A local blockchain is a private blockchain used for testing smart contracts without spending real ETH or waiting for transactions on the public Ethereum network. Developers use it because it is fast, free, repeatable, and safe. If a contract has a bug, it can be fixed locally before deployment to a real testnet or mainnet.</w:t>
+        <w:t>3.1 Home Page and Navigation</w:t>
+      </w:r>
+    </w:p>
+    <w:p>
+      <w:r>
+        <w:t>The home page introduces the purpose of the platform and provides direct links to registration and verification. A persistent navigation bar appears on every page. It includes a prominent Connect Wallet button, and after connection it displays the shortened address and current ALUT balance.</w:t>
+      </w:r>
+    </w:p>
+    <w:tbl>
+      <w:tblPr>
+        <w:tblW w:type="auto" w:w="0"/>
+        <w:jc w:val="center"/>
+        <w:tblLayout w:type="fixed"/>
+        <w:tblLook w:firstColumn="1" w:firstRow="1" w:lastColumn="0" w:lastRow="0" w:noHBand="0" w:noVBand="1" w:val="04A0"/>
+      </w:tblPr>
+      <w:tblGrid>
+        <w:gridCol w:w="9792"/>
+      </w:tblGrid>
+      <w:tr>
+        <w:trPr>
+          <w:cantSplit/>
+        </w:trPr>
+        <w:tc>
+          <w:tcPr>
+            <w:tcW w:type="dxa" w:w="9504"/>
+            <w:vAlign w:val="center"/>
+            <w:shd w:fill="F2F0EB"/>
+            <w:tcBorders>
+              <w:top w:val="dashed" w:sz="8" w:color="B9B4AA"/>
+              <w:left w:val="dashed" w:sz="8" w:color="B9B4AA"/>
+              <w:bottom w:val="dashed" w:sz="8" w:color="B9B4AA"/>
+              <w:right w:val="dashed" w:sz="8" w:color="B9B4AA"/>
+            </w:tcBorders>
+          </w:tcPr>
+          <w:p>
+            <w:pPr>
+              <w:spacing w:before="500" w:after="500"/>
+              <w:jc w:val="center"/>
+            </w:pPr>
+            <w:r>
+              <w:rPr>
+                <w:b/>
+                <w:color w:val="6E695F"/>
+                <w:sz w:val="20"/>
+              </w:rPr>
+              <w:t>INSERT ACTUAL SCREENSHOT HERE</w:t>
+              <w:br/>
+              <w:t>Figure 2. Home page with the Connect Wallet button and navigation.</w:t>
+            </w:r>
+          </w:p>
+        </w:tc>
+      </w:tr>
+    </w:tbl>
+    <w:p>
+      <w:pPr>
+        <w:pStyle w:val="FigureCaption"/>
+        <w:jc w:val="center"/>
+      </w:pPr>
+      <w:r>
+        <w:t>Figure 2. Home page with the Connect Wallet button and navigation.</w:t>
       </w:r>
     </w:p>
     <w:p>
       <w:pPr>
-        <w:spacing w:after="120" w:line="259" w:lineRule="auto"/>
+        <w:pStyle w:val="Heading2"/>
+        <w:keepNext/>
       </w:pPr>
       <w:r>
-        <w:t>A wallet address is a public identifier for an Ethereum account. It represents the account that can send transactions, deploy contracts, own NFTs, and hold ERC-20 tokens. When Hardhat starts a local node, it generates test wallet addresses with fake ETH so developers can deploy and test their contracts.</w:t>
+        <w:t>3.2 Wallet Connection</w:t>
+      </w:r>
+    </w:p>
+    <w:p>
+      <w:r>
+        <w:t>When the user selects Connect Wallet, the frontend checks whether window.ethereum is available. If MetaMask is not installed, the interface presents a helpful installation message. When available, ethers.js creates a BrowserProvider, requests the account, obtains a signer and loads the user balance from ALULogoToken. The dApp also listens for account and chain changes and refreshes its state.</w:t>
+      </w:r>
+    </w:p>
+    <w:p>
+      <w:r>
+        <w:t>A provider supports reading blockchain state. A signer represents an account that can authorise a transaction. Read-only calls do not require a signature because they do not change the blockchain. Transactions require a signature and gas because they modify shared state. The wallet signs on the user’s behalf because the private key belongs to the user and should never be held by the application.</w:t>
+      </w:r>
+    </w:p>
+    <w:tbl>
+      <w:tblPr>
+        <w:tblW w:type="auto" w:w="0"/>
+        <w:jc w:val="center"/>
+        <w:tblLayout w:type="fixed"/>
+        <w:tblLook w:firstColumn="1" w:firstRow="1" w:lastColumn="0" w:lastRow="0" w:noHBand="0" w:noVBand="1" w:val="04A0"/>
+      </w:tblPr>
+      <w:tblGrid>
+        <w:gridCol w:w="9792"/>
+      </w:tblGrid>
+      <w:tr>
+        <w:trPr>
+          <w:cantSplit/>
+        </w:trPr>
+        <w:tc>
+          <w:tcPr>
+            <w:tcW w:type="dxa" w:w="9504"/>
+            <w:vAlign w:val="center"/>
+            <w:shd w:fill="F2F0EB"/>
+            <w:tcBorders>
+              <w:top w:val="dashed" w:sz="8" w:color="B9B4AA"/>
+              <w:left w:val="dashed" w:sz="8" w:color="B9B4AA"/>
+              <w:bottom w:val="dashed" w:sz="8" w:color="B9B4AA"/>
+              <w:right w:val="dashed" w:sz="8" w:color="B9B4AA"/>
+            </w:tcBorders>
+          </w:tcPr>
+          <w:p>
+            <w:pPr>
+              <w:spacing w:before="500" w:after="500"/>
+              <w:jc w:val="center"/>
+            </w:pPr>
+            <w:r>
+              <w:rPr>
+                <w:b/>
+                <w:color w:val="6E695F"/>
+                <w:sz w:val="20"/>
+              </w:rPr>
+              <w:t>INSERT ACTUAL SCREENSHOT HERE</w:t>
+              <w:br/>
+              <w:t>Figure 3. Connected MetaMask account showing the shortened address and ALUT balance.</w:t>
+            </w:r>
+          </w:p>
+        </w:tc>
+      </w:tr>
+    </w:tbl>
+    <w:p>
+      <w:pPr>
+        <w:pStyle w:val="FigureCaption"/>
+        <w:jc w:val="center"/>
+      </w:pPr>
+      <w:r>
+        <w:t>Figure 3. Connected MetaMask account showing the shortened address and ALUT balance.</w:t>
       </w:r>
     </w:p>
     <w:p>
       <w:pPr>
-        <w:spacing w:after="120" w:line="259" w:lineRule="auto"/>
+        <w:pStyle w:val="Heading2"/>
+        <w:keepNext/>
       </w:pPr>
       <w:r>
-        <w:drawing>
-          <wp:inline xmlns:a="http://schemas.openxmlformats.org/drawingml/2006/main" xmlns:pic="http://schemas.openxmlformats.org/drawingml/2006/picture">
-            <wp:extent cx="5943600" cy="2916078"/>
-            <wp:docPr id="1" name="Picture 1"/>
-            <wp:cNvGraphicFramePr>
-              <a:graphicFrameLocks noChangeAspect="1"/>
-            </wp:cNvGraphicFramePr>
-            <a:graphic>
-              <a:graphicData uri="http://schemas.openxmlformats.org/drawingml/2006/picture">
-                <pic:pic>
-                  <pic:nvPicPr>
-                    <pic:cNvPr id="0" name="hardhat-node-screenshot.png"/>
-                    <pic:cNvPicPr/>
-                  </pic:nvPicPr>
-                  <pic:blipFill>
-                    <a:blip r:embed="rId9"/>
-                    <a:stretch>
-                      <a:fillRect/>
-                    </a:stretch>
-                  </pic:blipFill>
-                  <pic:spPr>
-                    <a:xfrm>
-                      <a:off x="0" y="0"/>
-                      <a:ext cx="5943600" cy="2916078"/>
-                    </a:xfrm>
-                    <a:prstGeom prst="rect"/>
-                  </pic:spPr>
-                </pic:pic>
-              </a:graphicData>
-            </a:graphic>
-          </wp:inline>
-        </w:drawing>
+        <w:t>3.3 File Upload and In-Browser Hashing</w:t>
+      </w:r>
+    </w:p>
+    <w:p>
+      <w:r>
+        <w:t>The upload component accepts common image formats and displays a preview. The browser reads the selected file as an ArrayBuffer and passes its bytes to crypto.subtle.digest("SHA-256", fileBuffer). The resulting 32-byte digest is converted into a 64-character hexadecimal value and prefixed with 0x, producing the bytes32 format required by Solidity.</w:t>
+      </w:r>
+    </w:p>
+    <w:p>
+      <w:r>
+        <w:t>Hashing in the browser improves privacy and integrity. The complete logo file does not need to leave the user’s device, and no server can accidentally alter the bytes before hashing. Only the fixed-length fingerprint and descriptive metadata are sent to the smart contract.</w:t>
+      </w:r>
+    </w:p>
+    <w:tbl>
+      <w:tblPr>
+        <w:tblW w:type="auto" w:w="0"/>
+        <w:jc w:val="center"/>
+        <w:tblLayout w:type="fixed"/>
+        <w:tblLook w:firstColumn="1" w:firstRow="1" w:lastColumn="0" w:lastRow="0" w:noHBand="0" w:noVBand="1" w:val="04A0"/>
+      </w:tblPr>
+      <w:tblGrid>
+        <w:gridCol w:w="9792"/>
+      </w:tblGrid>
+      <w:tr>
+        <w:trPr>
+          <w:cantSplit/>
+        </w:trPr>
+        <w:tc>
+          <w:tcPr>
+            <w:tcW w:type="dxa" w:w="9504"/>
+            <w:vAlign w:val="center"/>
+            <w:shd w:fill="F2F0EB"/>
+            <w:tcBorders>
+              <w:top w:val="dashed" w:sz="8" w:color="B9B4AA"/>
+              <w:left w:val="dashed" w:sz="8" w:color="B9B4AA"/>
+              <w:bottom w:val="dashed" w:sz="8" w:color="B9B4AA"/>
+              <w:right w:val="dashed" w:sz="8" w:color="B9B4AA"/>
+            </w:tcBorders>
+          </w:tcPr>
+          <w:p>
+            <w:pPr>
+              <w:spacing w:before="500" w:after="500"/>
+              <w:jc w:val="center"/>
+            </w:pPr>
+            <w:r>
+              <w:rPr>
+                <w:b/>
+                <w:color w:val="6E695F"/>
+                <w:sz w:val="20"/>
+              </w:rPr>
+              <w:t>INSERT ACTUAL SCREENSHOT HERE</w:t>
+              <w:br/>
+              <w:t>Figure 4. Uploaded image preview and generated SHA-256 bytes32 fingerprint.</w:t>
+            </w:r>
+          </w:p>
+        </w:tc>
+      </w:tr>
+    </w:tbl>
+    <w:p>
+      <w:pPr>
+        <w:pStyle w:val="FigureCaption"/>
+        <w:jc w:val="center"/>
+      </w:pPr>
+      <w:r>
+        <w:t>Figure 4. Uploaded image preview and generated SHA-256 bytes32 fingerprint.</w:t>
       </w:r>
     </w:p>
     <w:p>
       <w:pPr>
-        <w:spacing w:after="120" w:line="259" w:lineRule="auto"/>
+        <w:pStyle w:val="Heading2"/>
+        <w:keepNext/>
+      </w:pPr>
+      <w:r>
+        <w:t>3.4 Asset Registration</w:t>
+      </w:r>
+    </w:p>
+    <w:p>
+      <w:r>
+        <w:t>The registration page pre-fills the content hash generated by the upload component. The user supplies an asset name and confirms the MIME file type. Before sending the transaction, the frontend checks the public registeredContentHashes mapping. The smart contract performs the same duplicate check, ensuring that frontend manipulation cannot bypass the rule.</w:t>
+      </w:r>
+    </w:p>
+    <w:p>
+      <w:r>
+        <w:t>When the user submits, MetaMask displays the target contract, function transaction and estimated gas information. Approval means that the user agrees to sign and broadcast that exact state-changing operation. After confirmation, the frontend parses the AssetRegistered event from the receipt and displays the new token ID. If an identical hash already exists, the contract reverts and the interface presents a readable duplicate warning.</w:t>
+      </w:r>
+    </w:p>
+    <w:tbl>
+      <w:tblPr>
+        <w:tblW w:type="auto" w:w="0"/>
+        <w:jc w:val="center"/>
+        <w:tblLayout w:type="fixed"/>
+        <w:tblLook w:firstColumn="1" w:firstRow="1" w:lastColumn="0" w:lastRow="0" w:noHBand="0" w:noVBand="1" w:val="04A0"/>
+      </w:tblPr>
+      <w:tblGrid>
+        <w:gridCol w:w="9792"/>
+      </w:tblGrid>
+      <w:tr>
+        <w:trPr>
+          <w:cantSplit/>
+        </w:trPr>
+        <w:tc>
+          <w:tcPr>
+            <w:tcW w:type="dxa" w:w="9504"/>
+            <w:vAlign w:val="center"/>
+            <w:shd w:fill="F2F0EB"/>
+            <w:tcBorders>
+              <w:top w:val="dashed" w:sz="8" w:color="B9B4AA"/>
+              <w:left w:val="dashed" w:sz="8" w:color="B9B4AA"/>
+              <w:bottom w:val="dashed" w:sz="8" w:color="B9B4AA"/>
+              <w:right w:val="dashed" w:sz="8" w:color="B9B4AA"/>
+            </w:tcBorders>
+          </w:tcPr>
+          <w:p>
+            <w:pPr>
+              <w:spacing w:before="500" w:after="500"/>
+              <w:jc w:val="center"/>
+            </w:pPr>
+            <w:r>
+              <w:rPr>
+                <w:b/>
+                <w:color w:val="6E695F"/>
+                <w:sz w:val="20"/>
+              </w:rPr>
+              <w:t>INSERT ACTUAL SCREENSHOT HERE</w:t>
+              <w:br/>
+              <w:t>Figure 5. Successful asset registration showing the new token ID and transaction hash.</w:t>
+            </w:r>
+          </w:p>
+        </w:tc>
+      </w:tr>
+    </w:tbl>
+    <w:p>
+      <w:pPr>
+        <w:pStyle w:val="FigureCaption"/>
         <w:jc w:val="center"/>
       </w:pPr>
       <w:r>
-        <w:rPr>
-          <w:i/>
-          <w:sz w:val="18"/>
-        </w:rPr>
-        <w:t>Figure 1: Local Hardhat blockchain node showing generated test wallet addresses.</w:t>
+        <w:t>Figure 5. Successful asset registration showing the new token ID and transaction hash.</w:t>
+      </w:r>
+    </w:p>
+    <w:tbl>
+      <w:tblPr>
+        <w:tblW w:type="auto" w:w="0"/>
+        <w:jc w:val="center"/>
+        <w:tblLayout w:type="fixed"/>
+        <w:tblLook w:firstColumn="1" w:firstRow="1" w:lastColumn="0" w:lastRow="0" w:noHBand="0" w:noVBand="1" w:val="04A0"/>
+      </w:tblPr>
+      <w:tblGrid>
+        <w:gridCol w:w="9792"/>
+      </w:tblGrid>
+      <w:tr>
+        <w:trPr>
+          <w:cantSplit/>
+        </w:trPr>
+        <w:tc>
+          <w:tcPr>
+            <w:tcW w:type="dxa" w:w="9504"/>
+            <w:vAlign w:val="center"/>
+            <w:shd w:fill="F2F0EB"/>
+            <w:tcBorders>
+              <w:top w:val="dashed" w:sz="8" w:color="B9B4AA"/>
+              <w:left w:val="dashed" w:sz="8" w:color="B9B4AA"/>
+              <w:bottom w:val="dashed" w:sz="8" w:color="B9B4AA"/>
+              <w:right w:val="dashed" w:sz="8" w:color="B9B4AA"/>
+            </w:tcBorders>
+          </w:tcPr>
+          <w:p>
+            <w:pPr>
+              <w:spacing w:before="500" w:after="500"/>
+              <w:jc w:val="center"/>
+            </w:pPr>
+            <w:r>
+              <w:rPr>
+                <w:b/>
+                <w:color w:val="6E695F"/>
+                <w:sz w:val="20"/>
+              </w:rPr>
+              <w:t>INSERT ACTUAL SCREENSHOT HERE</w:t>
+              <w:br/>
+              <w:t>Figure 6. Duplicate registration warning for a previously registered fingerprint.</w:t>
+            </w:r>
+          </w:p>
+        </w:tc>
+      </w:tr>
+    </w:tbl>
+    <w:p>
+      <w:pPr>
+        <w:pStyle w:val="FigureCaption"/>
+        <w:jc w:val="center"/>
+      </w:pPr>
+      <w:r>
+        <w:t>Figure 6. Duplicate registration warning for a previously registered fingerprint.</w:t>
+      </w:r>
+    </w:p>
+    <w:p>
+      <w:pPr>
+        <w:pStyle w:val="Heading2"/>
+        <w:keepNext/>
+      </w:pPr>
+      <w:r>
+        <w:t>3.5 Public Logo Verification</w:t>
+      </w:r>
+    </w:p>
+    <w:p>
+      <w:r>
+        <w:t>The verification page supports both file upload and direct hash input. It does not require a wallet because verifyLogoIntegrity() is a view function. The dApp uses a read-only JSON-RPC provider to call the function and compare the supplied fingerprint with the fingerprint stored for token ID 1. An off-chain view call reads state without creating a blockchain transaction, so the user pays no gas.</w:t>
+      </w:r>
+    </w:p>
+    <w:p>
+      <w:r>
+        <w:t>When the hashes match, the page presents a green confirmation and loads the registered asset name, file type, registering wallet and timestamp. When they differ, it presents a red warning in plain language. A real-world user could be an ALU partner preparing an event poster. Before publishing, the partner could upload a logo received by email and confirm that it has not been modified. Trust comes from comparing the exact file fingerprint against an immutable contract record rather than trusting the file name or visual appearance.</w:t>
+      </w:r>
+    </w:p>
+    <w:tbl>
+      <w:tblPr>
+        <w:tblW w:type="auto" w:w="0"/>
+        <w:jc w:val="center"/>
+        <w:tblLayout w:type="fixed"/>
+        <w:tblLook w:firstColumn="1" w:firstRow="1" w:lastColumn="0" w:lastRow="0" w:noHBand="0" w:noVBand="1" w:val="04A0"/>
+      </w:tblPr>
+      <w:tblGrid>
+        <w:gridCol w:w="9792"/>
+      </w:tblGrid>
+      <w:tr>
+        <w:trPr>
+          <w:cantSplit/>
+        </w:trPr>
+        <w:tc>
+          <w:tcPr>
+            <w:tcW w:type="dxa" w:w="9504"/>
+            <w:vAlign w:val="center"/>
+            <w:shd w:fill="F2F0EB"/>
+            <w:tcBorders>
+              <w:top w:val="dashed" w:sz="8" w:color="B9B4AA"/>
+              <w:left w:val="dashed" w:sz="8" w:color="B9B4AA"/>
+              <w:bottom w:val="dashed" w:sz="8" w:color="B9B4AA"/>
+              <w:right w:val="dashed" w:sz="8" w:color="B9B4AA"/>
+            </w:tcBorders>
+          </w:tcPr>
+          <w:p>
+            <w:pPr>
+              <w:spacing w:before="500" w:after="500"/>
+              <w:jc w:val="center"/>
+            </w:pPr>
+            <w:r>
+              <w:rPr>
+                <w:b/>
+                <w:color w:val="6E695F"/>
+                <w:sz w:val="20"/>
+              </w:rPr>
+              <w:t>INSERT ACTUAL SCREENSHOT HERE</w:t>
+              <w:br/>
+              <w:t>Figure 7. Green authentic-logo verification result with registered metadata.</w:t>
+            </w:r>
+          </w:p>
+        </w:tc>
+      </w:tr>
+    </w:tbl>
+    <w:p>
+      <w:pPr>
+        <w:pStyle w:val="FigureCaption"/>
+        <w:jc w:val="center"/>
+      </w:pPr>
+      <w:r>
+        <w:t>Figure 7. Green authentic-logo verification result with registered metadata.</w:t>
+      </w:r>
+    </w:p>
+    <w:p>
+      <w:r>
+        <w:br w:type="page"/>
+      </w:r>
+    </w:p>
+    <w:tbl>
+      <w:tblPr>
+        <w:tblW w:type="auto" w:w="0"/>
+        <w:jc w:val="center"/>
+        <w:tblLayout w:type="fixed"/>
+        <w:tblLook w:firstColumn="1" w:firstRow="1" w:lastColumn="0" w:lastRow="0" w:noHBand="0" w:noVBand="1" w:val="04A0"/>
+      </w:tblPr>
+      <w:tblGrid>
+        <w:gridCol w:w="9792"/>
+      </w:tblGrid>
+      <w:tr>
+        <w:trPr>
+          <w:cantSplit/>
+        </w:trPr>
+        <w:tc>
+          <w:tcPr>
+            <w:tcW w:type="dxa" w:w="9504"/>
+            <w:vAlign w:val="center"/>
+            <w:shd w:fill="F2F0EB"/>
+            <w:tcBorders>
+              <w:top w:val="dashed" w:sz="8" w:color="B9B4AA"/>
+              <w:left w:val="dashed" w:sz="8" w:color="B9B4AA"/>
+              <w:bottom w:val="dashed" w:sz="8" w:color="B9B4AA"/>
+              <w:right w:val="dashed" w:sz="8" w:color="B9B4AA"/>
+            </w:tcBorders>
+          </w:tcPr>
+          <w:p>
+            <w:pPr>
+              <w:spacing w:before="500" w:after="500"/>
+              <w:jc w:val="center"/>
+            </w:pPr>
+            <w:r>
+              <w:rPr>
+                <w:b/>
+                <w:color w:val="6E695F"/>
+                <w:sz w:val="20"/>
+              </w:rPr>
+              <w:t>INSERT ACTUAL SCREENSHOT HERE</w:t>
+              <w:br/>
+              <w:t>Figure 8. Red warning after verifying a modified or incorrect logo.</w:t>
+            </w:r>
+          </w:p>
+        </w:tc>
+      </w:tr>
+    </w:tbl>
+    <w:p>
+      <w:pPr>
+        <w:pStyle w:val="FigureCaption"/>
+        <w:jc w:val="center"/>
+      </w:pPr>
+      <w:r>
+        <w:t>Figure 8. Red warning after verifying a modified or incorrect logo.</w:t>
+      </w:r>
+    </w:p>
+    <w:p>
+      <w:pPr>
+        <w:pStyle w:val="Heading2"/>
+        <w:keepNext/>
+      </w:pPr>
+      <w:r>
+        <w:t>3.6 Token Distribution Dashboard</w:t>
+      </w:r>
+    </w:p>
+    <w:p>
+      <w:r>
+        <w:t>The dashboard reads the fixed total supply, connected wallet balance, connected wallet ownership percentage and balances of three example stakeholder addresses. The deployment script initially allocates sample shares to a student representative, the communications office and a faculty representative so that the ownership table contains meaningful data.</w:t>
+      </w:r>
+    </w:p>
+    <w:p>
+      <w:r>
+        <w:t>The distribution form is only displayed when the connected address equals owner(). The frontend validates the recipient address, requires an amount greater than zero and checks the owner balance. However, the true security control remains the onlyOwner modifier in Solidity. If a non-owner calls distributeShares() directly, Ownable reverts the transaction before the transfer executes.</w:t>
+      </w:r>
+    </w:p>
+    <w:p>
+      <w:r>
+        <w:t>An example practical allocation would be ALUT assigned to the ALU communications office to represent its authorised stewardship of visual identity. In the current system, tokens demonstrate fractional allocation but do not automatically create legal rights. To support voting proportional to holdings, the contract could use OpenZeppelin ERC20Votes, checkpoints, delegation and governance proposal logic, or integrate with a Governor contract.</w:t>
+      </w:r>
+    </w:p>
+    <w:tbl>
+      <w:tblPr>
+        <w:tblW w:type="auto" w:w="0"/>
+        <w:jc w:val="center"/>
+        <w:tblLayout w:type="fixed"/>
+        <w:tblLook w:firstColumn="1" w:firstRow="1" w:lastColumn="0" w:lastRow="0" w:noHBand="0" w:noVBand="1" w:val="04A0"/>
+      </w:tblPr>
+      <w:tblGrid>
+        <w:gridCol w:w="9792"/>
+      </w:tblGrid>
+      <w:tr>
+        <w:trPr>
+          <w:cantSplit/>
+        </w:trPr>
+        <w:tc>
+          <w:tcPr>
+            <w:tcW w:type="dxa" w:w="9504"/>
+            <w:vAlign w:val="center"/>
+            <w:shd w:fill="F2F0EB"/>
+            <w:tcBorders>
+              <w:top w:val="dashed" w:sz="8" w:color="B9B4AA"/>
+              <w:left w:val="dashed" w:sz="8" w:color="B9B4AA"/>
+              <w:bottom w:val="dashed" w:sz="8" w:color="B9B4AA"/>
+              <w:right w:val="dashed" w:sz="8" w:color="B9B4AA"/>
+            </w:tcBorders>
+          </w:tcPr>
+          <w:p>
+            <w:pPr>
+              <w:spacing w:before="500" w:after="500"/>
+              <w:jc w:val="center"/>
+            </w:pPr>
+            <w:r>
+              <w:rPr>
+                <w:b/>
+                <w:color w:val="6E695F"/>
+                <w:sz w:val="20"/>
+              </w:rPr>
+              <w:t>INSERT ACTUAL SCREENSHOT HERE</w:t>
+              <w:br/>
+              <w:t>Figure 9. Token dashboard with total supply, connected balance and example holders.</w:t>
+            </w:r>
+          </w:p>
+        </w:tc>
+      </w:tr>
+    </w:tbl>
+    <w:p>
+      <w:pPr>
+        <w:pStyle w:val="FigureCaption"/>
+        <w:jc w:val="center"/>
+      </w:pPr>
+      <w:r>
+        <w:t>Figure 9. Token dashboard with total supply, connected balance and example holders.</w:t>
+      </w:r>
+    </w:p>
+    <w:tbl>
+      <w:tblPr>
+        <w:tblW w:type="auto" w:w="0"/>
+        <w:jc w:val="center"/>
+        <w:tblLayout w:type="fixed"/>
+        <w:tblLook w:firstColumn="1" w:firstRow="1" w:lastColumn="0" w:lastRow="0" w:noHBand="0" w:noVBand="1" w:val="04A0"/>
+      </w:tblPr>
+      <w:tblGrid>
+        <w:gridCol w:w="9792"/>
+      </w:tblGrid>
+      <w:tr>
+        <w:trPr>
+          <w:cantSplit/>
+        </w:trPr>
+        <w:tc>
+          <w:tcPr>
+            <w:tcW w:type="dxa" w:w="9504"/>
+            <w:vAlign w:val="center"/>
+            <w:shd w:fill="F2F0EB"/>
+            <w:tcBorders>
+              <w:top w:val="dashed" w:sz="8" w:color="B9B4AA"/>
+              <w:left w:val="dashed" w:sz="8" w:color="B9B4AA"/>
+              <w:bottom w:val="dashed" w:sz="8" w:color="B9B4AA"/>
+              <w:right w:val="dashed" w:sz="8" w:color="B9B4AA"/>
+            </w:tcBorders>
+          </w:tcPr>
+          <w:p>
+            <w:pPr>
+              <w:spacing w:before="500" w:after="500"/>
+              <w:jc w:val="center"/>
+            </w:pPr>
+            <w:r>
+              <w:rPr>
+                <w:b/>
+                <w:color w:val="6E695F"/>
+                <w:sz w:val="20"/>
+              </w:rPr>
+              <w:t>INSERT ACTUAL SCREENSHOT HERE</w:t>
+              <w:br/>
+              <w:t>Figure 10. Owner-only share distribution form and confirmed transfer.</w:t>
+            </w:r>
+          </w:p>
+        </w:tc>
+      </w:tr>
+    </w:tbl>
+    <w:p>
+      <w:pPr>
+        <w:pStyle w:val="FigureCaption"/>
+        <w:jc w:val="center"/>
+      </w:pPr>
+      <w:r>
+        <w:t>Figure 10. Owner-only share distribution form and confirmed transfer.</w:t>
       </w:r>
     </w:p>
     <w:p>
       <w:pPr>
         <w:pStyle w:val="Heading1"/>
-        <w:spacing w:after="120" w:line="259" w:lineRule="auto"/>
+        <w:keepNext/>
       </w:pPr>
       <w:r>
-        <w:t>Smart Contract Explanation</w:t>
+        <w:t>4. Wallet and Web3 Integration</w:t>
+      </w:r>
+    </w:p>
+    <w:p>
+      <w:r>
+        <w:t>The frontend maintains wallet state through a React context. connectWallet() requests an account and records the chain ID. It then reads balanceOf(), decimals() and owner() from ALULogoToken. The navigation component consumes this context so the wallet status is consistent on every page.</w:t>
       </w:r>
     </w:p>
     <w:p>
       <w:pPr>
-        <w:spacing w:after="120" w:line="259" w:lineRule="auto"/>
+        <w:pStyle w:val="ListBullet"/>
+        <w:spacing w:after="60"/>
       </w:pPr>
       <w:r>
-        <w:t>A smart contract is a program stored and executed on a blockchain. It is different from a normal server program because its logic and state are shared across the blockchain network. Once deployed, users interact with it by sending transactions, and the blockchain records the results. A server program can usually be changed or taken offline by its owner, but a deployed smart contract is much harder to alter unless upgrade logic was deliberately built in.</w:t>
+        <w:t>BrowserProvider connects ethers.js to the wallet injected into the browser.</w:t>
       </w:r>
     </w:p>
     <w:p>
       <w:pPr>
-        <w:spacing w:after="120" w:line="259" w:lineRule="auto"/>
+        <w:pStyle w:val="ListBullet"/>
+        <w:spacing w:after="60"/>
       </w:pPr>
       <w:r>
-        <w:t>The first contract is called ALUAssetRegistry. It extends OpenZeppelin's ERC-721 standard because the ALU logo is a unique digital asset. An NFT is a non-fungible token, meaning each token is distinct and not interchangeable like normal money. ERC-721 is appropriate because the registered logo should have one unique token ID and one set of metadata proving the file fingerprint and registration details.</w:t>
+        <w:t>JsonRpcProvider supports public calls without requesting a wallet account.</w:t>
       </w:r>
     </w:p>
     <w:p>
       <w:pPr>
-        <w:spacing w:after="120" w:line="259" w:lineRule="auto"/>
+        <w:pStyle w:val="ListBullet"/>
+        <w:spacing w:after="60"/>
       </w:pPr>
       <w:r>
-        <w:t>The contract defines an AssetMetadata struct with five fields: assetName, fileType, contentHash, registeredBy, and registeredAt. The contentHash is a bytes32 value containing the SHA-256 hash of the ALU logo file. SHA-256 produces a fixed-length fingerprint for any file. If even one pixel changes, the binary file changes and the resulting hash becomes completely different, which makes tampering easy to detect.</w:t>
+        <w:t>Contract instances combine an address, ABI and provider or signer.</w:t>
       </w:r>
     </w:p>
     <w:p>
       <w:pPr>
-        <w:spacing w:after="120" w:line="259" w:lineRule="auto"/>
+        <w:pStyle w:val="ListBullet"/>
+        <w:spacing w:after="60"/>
       </w:pPr>
       <w:r>
-        <w:drawing>
-          <wp:inline xmlns:a="http://schemas.openxmlformats.org/drawingml/2006/main" xmlns:pic="http://schemas.openxmlformats.org/drawingml/2006/picture">
-            <wp:extent cx="5943600" cy="1243584"/>
-            <wp:docPr id="2" name="Picture 2"/>
-            <wp:cNvGraphicFramePr>
-              <a:graphicFrameLocks noChangeAspect="1"/>
-            </wp:cNvGraphicFramePr>
-            <a:graphic>
-              <a:graphicData uri="http://schemas.openxmlformats.org/drawingml/2006/picture">
-                <pic:pic>
-                  <pic:nvPicPr>
-                    <pic:cNvPr id="0" name="hash-screenshot.png"/>
-                    <pic:cNvPicPr/>
-                  </pic:nvPicPr>
-                  <pic:blipFill>
-                    <a:blip r:embed="rId10"/>
-                    <a:stretch>
-                      <a:fillRect/>
-                    </a:stretch>
-                  </pic:blipFill>
-                  <pic:spPr>
-                    <a:xfrm>
-                      <a:off x="0" y="0"/>
-                      <a:ext cx="5943600" cy="1243584"/>
-                    </a:xfrm>
-                    <a:prstGeom prst="rect"/>
-                  </pic:spPr>
-                </pic:pic>
-              </a:graphicData>
-            </a:graphic>
-          </wp:inline>
-        </w:drawing>
+        <w:t>accountsChanged and chainChanged events refresh the interface when the user changes MetaMask state.</w:t>
       </w:r>
     </w:p>
     <w:p>
       <w:pPr>
-        <w:spacing w:after="120" w:line="259" w:lineRule="auto"/>
-        <w:jc w:val="center"/>
+        <w:pStyle w:val="ListBullet"/>
+        <w:spacing w:after="60"/>
       </w:pPr>
       <w:r>
-        <w:rPr>
-          <w:i/>
-          <w:sz w:val="18"/>
-        </w:rPr>
-        <w:t>Figure 2: SHA-256 hash generated from the alu-logo.png file included in this project.</w:t>
-      </w:r>
-    </w:p>
-    <w:p>
-      <w:pPr>
-        <w:spacing w:after="120" w:line="259" w:lineRule="auto"/>
-      </w:pPr>
-      <w:r>
-        <w:t>The registered ALU logo SHA-256 hash is:</w:t>
-      </w:r>
-    </w:p>
-    <w:p>
-      <w:pPr>
-        <w:spacing w:after="120" w:line="259" w:lineRule="auto"/>
-      </w:pPr>
-      <w:r>
-        <w:rPr>
-          <w:rFonts w:ascii="Courier New" w:hAnsi="Courier New"/>
-          <w:b/>
-        </w:rPr>
-        <w:t>0xe03128e7ed668d74c334ed965edf89d0e1b3da112f6aeb6233bfd191ad829348</w:t>
-      </w:r>
-    </w:p>
-    <w:p>
-      <w:pPr>
-        <w:spacing w:after="120" w:line="259" w:lineRule="auto"/>
-      </w:pPr>
-      <w:r>
-        <w:rPr>
-          <w:b/>
-        </w:rPr>
-        <w:t xml:space="preserve">registerAsset(): </w:t>
-      </w:r>
-      <w:r>
-        <w:t>This function receives the asset name, file type, and SHA-256 content hash. It checks that the hash has not already been registered, increments the token counter, mints a new ERC-721 NFT to the caller with _safeMint(), saves the metadata, marks the hash as used, emits AssetRegistered, and returns the new token ID.</w:t>
-      </w:r>
-    </w:p>
-    <w:p>
-      <w:pPr>
-        <w:spacing w:after="120" w:line="259" w:lineRule="auto"/>
-      </w:pPr>
-      <w:r>
-        <w:rPr>
-          <w:b/>
-        </w:rPr>
-        <w:t xml:space="preserve">verifyLogoIntegrity(): </w:t>
-      </w:r>
-      <w:r>
-        <w:t>This view function receives a token ID and a hash supplied by the caller. It compares the supplied hash with the stored hash. If they match, it returns true and the message "Logo is authentic." If not, it returns false and "Warning: logo does not match." Because it only reads data, it costs no gas when called off-chain.</w:t>
-      </w:r>
-    </w:p>
-    <w:p>
-      <w:pPr>
-        <w:spacing w:after="120" w:line="259" w:lineRule="auto"/>
-      </w:pPr>
-      <w:r>
-        <w:rPr>
-          <w:b/>
-        </w:rPr>
-        <w:t xml:space="preserve">getAsset(): </w:t>
-      </w:r>
-      <w:r>
-        <w:t>This view function returns the complete AssetMetadata struct for a token ID, allowing anyone to inspect the stored asset name, file type, hash, registering wallet, and timestamp.</w:t>
-      </w:r>
-    </w:p>
-    <w:p>
-      <w:pPr>
-        <w:spacing w:after="120" w:line="259" w:lineRule="auto"/>
-      </w:pPr>
-      <w:r>
-        <w:t>The data cannot be casually changed once stored because blockchain state is maintained through consensus and each transaction becomes part of the chain history. In this project, there is also no function that allows an existing asset hash to be edited. Therefore, once a logo hash is registered, the contract can be used as a permanent verification record.</w:t>
-      </w:r>
-    </w:p>
-    <w:p>
-      <w:pPr>
-        <w:spacing w:after="120" w:line="259" w:lineRule="auto"/>
-      </w:pPr>
-      <w:r>
-        <w:drawing>
-          <wp:inline xmlns:a="http://schemas.openxmlformats.org/drawingml/2006/main" xmlns:pic="http://schemas.openxmlformats.org/drawingml/2006/picture">
-            <wp:extent cx="5943600" cy="1393031"/>
-            <wp:docPr id="3" name="Picture 3"/>
-            <wp:cNvGraphicFramePr>
-              <a:graphicFrameLocks noChangeAspect="1"/>
-            </wp:cNvGraphicFramePr>
-            <a:graphic>
-              <a:graphicData uri="http://schemas.openxmlformats.org/drawingml/2006/picture">
-                <pic:pic>
-                  <pic:nvPicPr>
-                    <pic:cNvPr id="0" name="deploy-screenshot.png"/>
-                    <pic:cNvPicPr/>
-                  </pic:nvPicPr>
-                  <pic:blipFill>
-                    <a:blip r:embed="rId11"/>
-                    <a:stretch>
-                      <a:fillRect/>
-                    </a:stretch>
-                  </pic:blipFill>
-                  <pic:spPr>
-                    <a:xfrm>
-                      <a:off x="0" y="0"/>
-                      <a:ext cx="5943600" cy="1393031"/>
-                    </a:xfrm>
-                    <a:prstGeom prst="rect"/>
-                  </pic:spPr>
-                </pic:pic>
-              </a:graphicData>
-            </a:graphic>
-          </wp:inline>
-        </w:drawing>
-      </w:r>
-    </w:p>
-    <w:p>
-      <w:pPr>
-        <w:spacing w:after="120" w:line="259" w:lineRule="auto"/>
-        <w:jc w:val="center"/>
-      </w:pPr>
-      <w:r>
-        <w:rPr>
-          <w:i/>
-          <w:sz w:val="18"/>
-        </w:rPr>
-        <w:t>Figure 3: Deployment script output showing contract deployment, logo registration, and ALUT deployment.</w:t>
+        <w:t>The dApp can request a switch to Hardhat chain ID 31337 and can propose the local network configuration.</w:t>
       </w:r>
     </w:p>
     <w:p>
       <w:pPr>
         <w:pStyle w:val="Heading1"/>
-        <w:spacing w:after="120" w:line="259" w:lineRule="auto"/>
+        <w:keepNext/>
       </w:pPr>
       <w:r>
-        <w:t>Tokenisation</w:t>
+        <w:t>5. Verification and Trust Model</w:t>
       </w:r>
     </w:p>
     <w:p>
-      <w:pPr>
-        <w:spacing w:after="120" w:line="259" w:lineRule="auto"/>
-      </w:pPr>
       <w:r>
-        <w:t>Tokenisation means representing ownership or rights to a real or digital asset using blockchain tokens. In this assignment, the ALU logo is first registered as one unique NFT, then its ownership shares are represented by 1,000,000 ALUT ERC-20 tokens. ALU could distribute tokens to approved internal stakeholders such as administration, faculty, student representatives, brand/communications teams, or departments involved in managing institutional identity. The tokens would represent a share of governance, licensing rights, or symbolic ownership depending on ALU's policy.</w:t>
+        <w:t>A SHA-256 digest changes when even one byte of the image changes. Consequently, a visually subtle edit, recompression or embedded metadata change normally creates a different fingerprint. The smart contract does not decide whether an image looks similar; it performs an exact integrity comparison. This design is suitable for proving whether a file is byte-for-byte identical to the registered official copy.</w:t>
       </w:r>
     </w:p>
     <w:p>
-      <w:pPr>
-        <w:spacing w:after="120" w:line="259" w:lineRule="auto"/>
-      </w:pPr>
       <w:r>
-        <w:t>The second contract is called ALULogoToken. It extends ERC-20 because ownership shares must be fungible. Unlike the ERC-721 logo NFT, every ALUT token is identical to every other ALUT token. The constructor creates the token name "ALU Logo Token" and symbol "ALUT", then mints the fixed supply of 1,000,000 tokens to the logo owner. The distributeShares() function is restricted with onlyOwner so only the owner can send official shares from the owner balance. The ownershipPercentage() function calculates a holder's percentage from their token balance divided by total supply.</w:t>
-      </w:r>
-    </w:p>
-    <w:p>
-      <w:pPr>
-        <w:spacing w:after="120" w:line="259" w:lineRule="auto"/>
-      </w:pPr>
-      <w:r>
-        <w:t>ERC-721 and ERC-20 solve different problems. ERC-721 is best for the logo registration because the logo file is unique and should have one token ID. ERC-20 is best for ownership shares because the shares are divisible and interchangeable. If a faculty member holds 100,000 ALUT out of 1,000,000 total, they hold 10% of the tokenised logo shares. In practice, that could mean a 10% symbolic or governance stake in the asset, depending on the rules ALU attaches to ALUT.</w:t>
+        <w:t>The public page is trustworthy to the extent that the user trusts the deployed contract address, the blockchain network and the original registration process. The interface exposes the registered metadata and uses a deterministic comparison. For production deployment, ALU should publish the verified contract address through an official institutional channel and deploy to a stable public network or appropriate permissioned blockchain.</w:t>
       </w:r>
     </w:p>
     <w:p>
       <w:pPr>
         <w:pStyle w:val="Heading1"/>
-        <w:spacing w:after="120" w:line="259" w:lineRule="auto"/>
+        <w:keepNext/>
       </w:pPr>
       <w:r>
-        <w:t>Test Results</w:t>
+        <w:t>6. Automated Test Results</w:t>
+      </w:r>
+    </w:p>
+    <w:p>
+      <w:r>
+        <w:t>The original eight tests were preserved and five additional dApp integration tests were added, producing thirteen tests in total. The new tests verify the values and transformations used by the interface rather than only the basic contract behaviour.</w:t>
       </w:r>
     </w:p>
     <w:p>
       <w:pPr>
-        <w:spacing w:after="120" w:line="259" w:lineRule="auto"/>
+        <w:pStyle w:val="ListNumber"/>
+        <w:spacing w:after="60"/>
       </w:pPr>
       <w:r>
-        <w:t>The automated test file contains eight tests. Five tests confirm the ERC-721 logo registry: successful registration, duplicate rejection, correct integrity verification, incorrect integrity warning, and metadata lookup. Three tests confirm the ERC-20 tokenisation contract: full supply minting, share distribution, and percentage calculation.</w:t>
+        <w:t>The frontend reads totalSupply() and formats the result as 1,000,000.</w:t>
       </w:r>
     </w:p>
     <w:p>
       <w:pPr>
-        <w:spacing w:after="120" w:line="259" w:lineRule="auto"/>
+        <w:pStyle w:val="ListNumber"/>
+        <w:spacing w:after="60"/>
       </w:pPr>
       <w:r>
-        <w:drawing>
-          <wp:inline xmlns:a="http://schemas.openxmlformats.org/drawingml/2006/main" xmlns:pic="http://schemas.openxmlformats.org/drawingml/2006/picture">
-            <wp:extent cx="5943600" cy="2804636"/>
-            <wp:docPr id="4" name="Picture 4"/>
-            <wp:cNvGraphicFramePr>
-              <a:graphicFrameLocks noChangeAspect="1"/>
-            </wp:cNvGraphicFramePr>
-            <a:graphic>
-              <a:graphicData uri="http://schemas.openxmlformats.org/drawingml/2006/picture">
-                <pic:pic>
-                  <pic:nvPicPr>
-                    <pic:cNvPr id="0" name="test-results-screenshot.png"/>
-                    <pic:cNvPicPr/>
-                  </pic:nvPicPr>
-                  <pic:blipFill>
-                    <a:blip r:embed="rId12"/>
-                    <a:stretch>
-                      <a:fillRect/>
-                    </a:stretch>
-                  </pic:blipFill>
-                  <pic:spPr>
-                    <a:xfrm>
-                      <a:off x="0" y="0"/>
-                      <a:ext cx="5943600" cy="2804636"/>
-                    </a:xfrm>
-                    <a:prstGeom prst="rect"/>
-                  </pic:spPr>
-                </pic:pic>
-              </a:graphicData>
-            </a:graphic>
-          </wp:inline>
-        </w:drawing>
+        <w:t>The hashing logic returns the correct SHA-256 bytes32 fingerprint for alu-logo.png.</w:t>
       </w:r>
     </w:p>
     <w:p>
       <w:pPr>
-        <w:spacing w:after="120" w:line="259" w:lineRule="auto"/>
+        <w:pStyle w:val="ListNumber"/>
+        <w:spacing w:after="60"/>
+      </w:pPr>
+      <w:r>
+        <w:t>The authentic hash produces a success view model.</w:t>
+      </w:r>
+    </w:p>
+    <w:p>
+      <w:pPr>
+        <w:pStyle w:val="ListNumber"/>
+        <w:spacing w:after="60"/>
+      </w:pPr>
+      <w:r>
+        <w:t>An incorrect hash produces a verification-failure view model.</w:t>
+      </w:r>
+    </w:p>
+    <w:p>
+      <w:pPr>
+        <w:pStyle w:val="ListNumber"/>
+        <w:spacing w:after="60"/>
+      </w:pPr>
+      <w:r>
+        <w:t>A confirmed distributeShares() transaction increases the recipient balance by the correct amount.</w:t>
+      </w:r>
+    </w:p>
+    <w:tbl>
+      <w:tblPr>
+        <w:tblW w:type="auto" w:w="0"/>
+        <w:jc w:val="center"/>
+        <w:tblLayout w:type="fixed"/>
+        <w:tblLook w:firstColumn="1" w:firstRow="1" w:lastColumn="0" w:lastRow="0" w:noHBand="0" w:noVBand="1" w:val="04A0"/>
+      </w:tblPr>
+      <w:tblGrid>
+        <w:gridCol w:w="9792"/>
+      </w:tblGrid>
+      <w:tr>
+        <w:trPr>
+          <w:cantSplit/>
+        </w:trPr>
+        <w:tc>
+          <w:tcPr>
+            <w:tcW w:type="dxa" w:w="9504"/>
+            <w:vAlign w:val="center"/>
+            <w:shd w:fill="F2F0EB"/>
+            <w:tcBorders>
+              <w:top w:val="dashed" w:sz="8" w:color="B9B4AA"/>
+              <w:left w:val="dashed" w:sz="8" w:color="B9B4AA"/>
+              <w:bottom w:val="dashed" w:sz="8" w:color="B9B4AA"/>
+              <w:right w:val="dashed" w:sz="8" w:color="B9B4AA"/>
+            </w:tcBorders>
+          </w:tcPr>
+          <w:p>
+            <w:pPr>
+              <w:spacing w:before="500" w:after="500"/>
+              <w:jc w:val="center"/>
+            </w:pPr>
+            <w:r>
+              <w:rPr>
+                <w:b/>
+                <w:color w:val="6E695F"/>
+                <w:sz w:val="20"/>
+              </w:rPr>
+              <w:t>INSERT ACTUAL SCREENSHOT HERE</w:t>
+              <w:br/>
+              <w:t>Figure 11. Hardhat terminal output showing all thirteen tests passing.</w:t>
+            </w:r>
+          </w:p>
+        </w:tc>
+      </w:tr>
+    </w:tbl>
+    <w:p>
+      <w:pPr>
+        <w:pStyle w:val="FigureCaption"/>
         <w:jc w:val="center"/>
       </w:pPr>
       <w:r>
-        <w:rPr>
-          <w:i/>
-          <w:sz w:val="18"/>
-        </w:rPr>
-        <w:t>Figure 4: All eight Hardhat automated tests passing.</w:t>
+        <w:t>Figure 11. Hardhat terminal output showing all thirteen tests passing.</w:t>
       </w:r>
     </w:p>
     <w:p>
       <w:pPr>
         <w:pStyle w:val="Heading1"/>
-        <w:spacing w:after="120" w:line="259" w:lineRule="auto"/>
+        <w:keepNext/>
       </w:pPr>
       <w:r>
-        <w:t>Conclusion</w:t>
+        <w:t>7. Security, Design Decisions and Limitations</w:t>
       </w:r>
     </w:p>
     <w:p>
       <w:pPr>
-        <w:spacing w:after="120" w:line="259" w:lineRule="auto"/>
+        <w:pStyle w:val="ListBullet"/>
+        <w:spacing w:after="60"/>
       </w:pPr>
       <w:r>
-        <w:t>This assignment helped me understand how cryptocurrency platforms onboard users and how blockchain can protect digital assets beyond simple buying and selling. I learned how a file hash can prove whether a digital file is authentic, how ERC-721 can register a unique asset, and how ERC-20 can represent fractional ownership shares. If I had more time, I would add a web dApp for uploading a logo, automatically hashing it in the browser, verifying the hash against the contract, and displaying token ownership percentages in a simple interface.</w:t>
+        <w:t>No image file is uploaded to an application server; hashing occurs inside the browser.</w:t>
+      </w:r>
+    </w:p>
+    <w:p>
+      <w:pPr>
+        <w:pStyle w:val="ListBullet"/>
+        <w:spacing w:after="60"/>
+      </w:pPr>
+      <w:r>
+        <w:t>The smart contract rejects empty and duplicate content hashes.</w:t>
+      </w:r>
+    </w:p>
+    <w:p>
+      <w:pPr>
+        <w:pStyle w:val="ListBullet"/>
+        <w:spacing w:after="60"/>
+      </w:pPr>
+      <w:r>
+        <w:t>The owner-only token function is protected at contract level, not only by hiding a frontend form.</w:t>
+      </w:r>
+    </w:p>
+    <w:p>
+      <w:pPr>
+        <w:pStyle w:val="ListBullet"/>
+        <w:spacing w:after="60"/>
+      </w:pPr>
+      <w:r>
+        <w:t>No wallet private key is stored in the codebase or application state.</w:t>
+      </w:r>
+    </w:p>
+    <w:p>
+      <w:pPr>
+        <w:pStyle w:val="ListBullet"/>
+        <w:spacing w:after="60"/>
+      </w:pPr>
+      <w:r>
+        <w:t>The default local deployment is appropriate for development and demonstration but cannot serve remote public users.</w:t>
+      </w:r>
+    </w:p>
+    <w:p>
+      <w:pPr>
+        <w:pStyle w:val="ListBullet"/>
+        <w:spacing w:after="60"/>
+      </w:pPr>
+      <w:r>
+        <w:t>Restarting the Hardhat node removes local state, so the contracts must be redeployed and addresses regenerated.</w:t>
+      </w:r>
+    </w:p>
+    <w:p>
+      <w:pPr>
+        <w:pStyle w:val="ListBullet"/>
+        <w:spacing w:after="60"/>
+      </w:pPr>
+      <w:r>
+        <w:t>ownershipPercentage() returns whole-number values, meaning holdings below one percent appear as zero percent.</w:t>
+      </w:r>
+    </w:p>
+    <w:p>
+      <w:pPr>
+        <w:pStyle w:val="ListBullet"/>
+        <w:spacing w:after="60"/>
+      </w:pPr>
+      <w:r>
+        <w:t>The current token contract does not implement voting, legal shareholder rights or transfer restrictions.</w:t>
       </w:r>
     </w:p>
     <w:p>
       <w:pPr>
         <w:pStyle w:val="Heading1"/>
-        <w:spacing w:after="120" w:line="259" w:lineRule="auto"/>
+        <w:keepNext/>
       </w:pPr>
       <w:r>
-        <w:t>GitHub Link and Video</w:t>
+        <w:t>8. Conclusion</w:t>
       </w:r>
     </w:p>
     <w:p>
-      <w:pPr>
-        <w:spacing w:after="120" w:line="259" w:lineRule="auto"/>
-      </w:pPr>
       <w:r>
-        <w:t>GitHub repository: PASTE_YOUR_PUBLIC_GITHUB_LINK_HERE</w:t>
+        <w:t>This assignment demonstrated how a smart contract becomes a usable product through frontend integration. The project connected React, ethers.js, MetaMask, the Web Crypto API and Hardhat into one workflow. The most important learning outcome was understanding the distinction between public blockchain reads and signed state-changing transactions. The browser can independently calculate a file fingerprint and verify it for free, while ownership changes remain controlled by wallet signatures and smart-contract access rules.</w:t>
       </w:r>
     </w:p>
     <w:p>
-      <w:pPr>
-        <w:spacing w:after="120" w:line="259" w:lineRule="auto"/>
-      </w:pPr>
       <w:r>
-        <w:t>Demo video link: PASTE_YOUR_VIDEO_LINK_HERE</w:t>
+        <w:t>With more time, the system could be deployed to Sepolia, support WalletConnect, index all historical holders from Transfer events, add role-based ALU administration, implement ERC20Votes governance and publish the frontend through a permanent hosting service. These improvements would move the prototype from a local academic demonstration toward a publicly accessible institutional asset-verification platform.</w:t>
       </w:r>
     </w:p>
     <w:p>
       <w:pPr>
         <w:pStyle w:val="Heading1"/>
-        <w:spacing w:after="120" w:line="259" w:lineRule="auto"/>
+        <w:keepNext/>
+      </w:pPr>
+      <w:r>
+        <w:t>9. Repository and Video Demonstration</w:t>
+      </w:r>
+    </w:p>
+    <w:p>
+      <w:r>
+        <w:t>GitHub repository: https://github.com/Kodedbykenzie/alu-digital-asset-protection</w:t>
+      </w:r>
+    </w:p>
+    <w:p>
+      <w:r>
+        <w:t>Deployed website URL: [INSERT FINAL WEBSITE URL]</w:t>
+      </w:r>
+    </w:p>
+    <w:p>
+      <w:r>
+        <w:t>Video demonstration URL: [INSERT FINAL VIDEO LINK]</w:t>
+      </w:r>
+    </w:p>
+    <w:p>
+      <w:pPr>
+        <w:pStyle w:val="Heading1"/>
+        <w:keepNext/>
       </w:pPr>
       <w:r>
         <w:t>References</w:t>
@@ -630,52 +1318,101 @@
     </w:p>
     <w:p>
       <w:pPr>
-        <w:spacing w:after="120" w:line="259" w:lineRule="auto"/>
+        <w:ind w:left="432" w:hanging="432"/>
       </w:pPr>
       <w:r>
-        <w:t>Coinbase. Identity verification and KYC guidance. Coinbase Help Center.</w:t>
+        <w:t>Ethereum Foundation. Ethereum development networks and smart contract concepts.</w:t>
       </w:r>
     </w:p>
     <w:p>
       <w:pPr>
-        <w:spacing w:after="120" w:line="259" w:lineRule="auto"/>
+        <w:ind w:left="432" w:hanging="432"/>
       </w:pPr>
       <w:r>
-        <w:t>Coinbase. Pricing and fees disclosures. Coinbase Help Center.</w:t>
+        <w:t>Hardhat. Hardhat development environment documentation.</w:t>
       </w:r>
     </w:p>
     <w:p>
       <w:pPr>
-        <w:spacing w:after="120" w:line="259" w:lineRule="auto"/>
+        <w:ind w:left="432" w:hanging="432"/>
       </w:pPr>
       <w:r>
-        <w:t>Hardhat. Hardhat Network and Getting Started documentation. Nomic Foundation.</w:t>
+        <w:t>OpenZeppelin. Contracts documentation for ERC721, ERC20 and Ownable.</w:t>
       </w:r>
     </w:p>
     <w:p>
       <w:pPr>
-        <w:spacing w:after="120" w:line="259" w:lineRule="auto"/>
+        <w:ind w:left="432" w:hanging="432"/>
       </w:pPr>
       <w:r>
-        <w:t>OpenZeppelin. Contracts documentation for ERC-20, ERC-721, and Ownable.</w:t>
+        <w:t>ethers.js. Version 6 documentation for providers, signers and contracts.</w:t>
       </w:r>
     </w:p>
     <w:p>
       <w:pPr>
-        <w:spacing w:after="120" w:line="259" w:lineRule="auto"/>
+        <w:ind w:left="432" w:hanging="432"/>
       </w:pPr>
       <w:r>
-        <w:t>African Leadership University. Official ALU website logo image and institutional information.</w:t>
+        <w:t>Mozilla Developer Network. Web Crypto API and SubtleCrypto.digest documentation.</w:t>
+      </w:r>
+    </w:p>
+    <w:p>
+      <w:pPr>
+        <w:ind w:left="432" w:hanging="432"/>
+      </w:pPr>
+      <w:r>
+        <w:t>React and Vite documentation for frontend development.</w:t>
       </w:r>
     </w:p>
     <w:sectPr>
+      <w:headerReference w:type="default" r:id="rId9"/>
+      <w:footerReference w:type="default" r:id="rId10"/>
       <w:pgSz w:w="12240" w:h="15840"/>
-      <w:pgMar w:top="1008" w:right="1080" w:bottom="1008" w:left="1080" w:header="720" w:footer="720" w:gutter="0"/>
+      <w:pgMar w:top="1080" w:right="1224" w:bottom="1080" w:left="1224" w:header="720" w:footer="720" w:gutter="0"/>
       <w:cols w:space="720"/>
       <w:docGrid w:linePitch="360"/>
     </w:sectPr>
   </w:body>
 </w:document>
+</file>
+
+<file path=word/footer1.xml><?xml version="1.0" encoding="utf-8"?>
+<w:ftr xmlns:m="http://schemas.openxmlformats.org/officeDocument/2006/math" xmlns:mc="http://schemas.openxmlformats.org/markup-compatibility/2006" xmlns:mo="http://schemas.microsoft.com/office/mac/office/2008/main" xmlns:mv="urn:schemas-microsoft-com:mac:vml" xmlns:o="urn:schemas-microsoft-com:office:office" xmlns:r="http://schemas.openxmlformats.org/officeDocument/2006/relationships" xmlns:v="urn:schemas-microsoft-com:vml" xmlns:w10="urn:schemas-microsoft-com:office:word" xmlns:w14="http://schemas.microsoft.com/office/word/2010/wordml" xmlns:w="http://schemas.openxmlformats.org/wordprocessingml/2006/main" xmlns:wne="http://schemas.microsoft.com/office/word/2006/wordml" xmlns:wp14="http://schemas.microsoft.com/office/word/2010/wordprocessingDrawing" xmlns:wp="http://schemas.openxmlformats.org/drawingml/2006/wordprocessingDrawing" xmlns:wpc="http://schemas.microsoft.com/office/word/2010/wordprocessingCanvas" xmlns:wpg="http://schemas.microsoft.com/office/word/2010/wordprocessingGroup" xmlns:wpi="http://schemas.microsoft.com/office/word/2010/wordprocessingInk" xmlns:wps="http://schemas.microsoft.com/office/word/2010/wordprocessingShape" mc:Ignorable="w14 wp14">
+  <w:p>
+    <w:pPr>
+      <w:pStyle w:val="Footer"/>
+      <w:jc w:val="center"/>
+    </w:pPr>
+    <w:r>
+      <w:rPr>
+        <w:rFonts w:ascii="Arial" w:hAnsi="Arial"/>
+        <w:color w:val="646464"/>
+        <w:sz w:val="16"/>
+      </w:rPr>
+      <w:t xml:space="preserve">Page </w:t>
+    </w:r>
+    <w:fldSimple w:instr="PAGE"/>
+  </w:p>
+</w:ftr>
+</file>
+
+<file path=word/header1.xml><?xml version="1.0" encoding="utf-8"?>
+<w:hdr xmlns:m="http://schemas.openxmlformats.org/officeDocument/2006/math" xmlns:mc="http://schemas.openxmlformats.org/markup-compatibility/2006" xmlns:mo="http://schemas.microsoft.com/office/mac/office/2008/main" xmlns:mv="urn:schemas-microsoft-com:mac:vml" xmlns:o="urn:schemas-microsoft-com:office:office" xmlns:r="http://schemas.openxmlformats.org/officeDocument/2006/relationships" xmlns:v="urn:schemas-microsoft-com:vml" xmlns:w10="urn:schemas-microsoft-com:office:word" xmlns:w14="http://schemas.microsoft.com/office/word/2010/wordml" xmlns:w="http://schemas.openxmlformats.org/wordprocessingml/2006/main" xmlns:wne="http://schemas.microsoft.com/office/word/2006/wordml" xmlns:wp14="http://schemas.microsoft.com/office/word/2010/wordprocessingDrawing" xmlns:wp="http://schemas.openxmlformats.org/drawingml/2006/wordprocessingDrawing" xmlns:wpc="http://schemas.microsoft.com/office/word/2010/wordprocessingCanvas" xmlns:wpg="http://schemas.microsoft.com/office/word/2010/wordprocessingGroup" xmlns:wpi="http://schemas.microsoft.com/office/word/2010/wordprocessingInk" xmlns:wps="http://schemas.microsoft.com/office/word/2010/wordprocessingShape" mc:Ignorable="w14 wp14">
+  <w:p>
+    <w:pPr>
+      <w:pStyle w:val="Header"/>
+      <w:jc w:val="right"/>
+    </w:pPr>
+    <w:r>
+      <w:rPr>
+        <w:rFonts w:ascii="Arial" w:hAnsi="Arial"/>
+        <w:color w:val="646464"/>
+        <w:sz w:val="16"/>
+      </w:rPr>
+      <w:t>ALU Digital Asset Protection DApp - Individual Assignment 2</w:t>
+    </w:r>
+  </w:p>
+</w:hdr>
 </file>
 
 <file path=word/numbering.xml><?xml version="1.0" encoding="utf-8"?>
@@ -1041,6 +1778,9 @@
     <w:name w:val="Normal"/>
     <w:qFormat/>
     <w:rsid w:val="00FC693F"/>
+    <w:pPr>
+      <w:spacing w:after="120" w:line="276" w:lineRule="auto"/>
+    </w:pPr>
     <w:rPr>
       <w:rFonts w:ascii="Arial" w:hAnsi="Arial" w:eastAsia="Arial"/>
       <w:sz w:val="21"/>
@@ -1108,8 +1848,8 @@
       <w:rFonts w:asciiTheme="majorHAnsi" w:eastAsiaTheme="majorEastAsia" w:hAnsiTheme="majorHAnsi" w:cstheme="majorBidi" w:ascii="Arial" w:hAnsi="Arial" w:eastAsia="Arial"/>
       <w:b/>
       <w:bCs/>
-      <w:color w:val="1F4E5F"/>
-      <w:sz w:val="30"/>
+      <w:color w:val="E2352D"/>
+      <w:sz w:val="34"/>
       <w:szCs w:val="28"/>
     </w:rPr>
   </w:style>
@@ -1132,8 +1872,8 @@
       <w:rFonts w:asciiTheme="majorHAnsi" w:eastAsiaTheme="majorEastAsia" w:hAnsiTheme="majorHAnsi" w:cstheme="majorBidi" w:ascii="Arial" w:hAnsi="Arial" w:eastAsia="Arial"/>
       <w:b/>
       <w:bCs/>
-      <w:color w:val="1F4E5F"/>
-      <w:sz w:val="24"/>
+      <w:color w:val="151515"/>
+      <w:sz w:val="26"/>
       <w:szCs w:val="26"/>
     </w:rPr>
   </w:style>
@@ -1153,10 +1893,11 @@
       <w:outlineLvl w:val="2"/>
     </w:pPr>
     <w:rPr>
-      <w:rFonts w:asciiTheme="majorHAnsi" w:eastAsiaTheme="majorEastAsia" w:hAnsiTheme="majorHAnsi" w:cstheme="majorBidi"/>
+      <w:rFonts w:asciiTheme="majorHAnsi" w:eastAsiaTheme="majorEastAsia" w:hAnsiTheme="majorHAnsi" w:cstheme="majorBidi" w:ascii="Arial" w:hAnsi="Arial" w:eastAsia="Arial"/>
       <w:b/>
       <w:bCs/>
-      <w:color w:val="4F81BD" w:themeColor="accent1"/>
+      <w:color w:val="151515"/>
+      <w:sz w:val="22"/>
     </w:rPr>
   </w:style>
   <w:style w:type="paragraph" w:styleId="Heading4">
@@ -1395,10 +2136,11 @@
     </w:pPr>
     <w:rPr>
       <w:rFonts w:asciiTheme="majorHAnsi" w:eastAsiaTheme="majorEastAsia" w:hAnsiTheme="majorHAnsi" w:cstheme="majorBidi" w:ascii="Arial" w:hAnsi="Arial" w:eastAsia="Arial"/>
-      <w:color w:val="1F4E5F"/>
+      <w:b/>
+      <w:color w:val="151515"/>
       <w:spacing w:val="5"/>
       <w:kern w:val="28"/>
-      <w:sz w:val="40"/>
+      <w:sz w:val="52"/>
       <w:szCs w:val="52"/>
     </w:rPr>
   </w:style>
@@ -12727,6 +13469,18 @@
         <w:shd w:val="clear" w:color="auto" w:fill="FBCAA2" w:themeFill="accent6" w:themeFillTint="7F"/>
       </w:tcPr>
     </w:tblStylePr>
+  </w:style>
+  <w:style w:type="paragraph" w:customStyle="1" w:styleId="FigureCaption">
+    <w:name w:val="Figure Caption"/>
+    <w:pPr>
+      <w:spacing w:after="160"/>
+    </w:pPr>
+    <w:rPr>
+      <w:rFonts w:ascii="Arial" w:hAnsi="Arial"/>
+      <w:i/>
+      <w:color w:val="5A5A5A"/>
+      <w:sz w:val="18"/>
+    </w:rPr>
   </w:style>
 </w:styles>
 </file>

</xml_diff>